<commit_message>
added validation folder - dm-k5
</commit_message>
<xml_diff>
--- a/BGIL_DBT/validation/DM-K5.docx
+++ b/BGIL_DBT/validation/DM-K5.docx
@@ -437,75 +437,6 @@
           </w:p>
         </w:tc>
       </w:tr>
-      <w:tr>
-        <w:tc>
-          <w:tcPr>
-            <w:tcW w:type="dxa" w:w="4320"/>
-          </w:tcPr>
-          <w:p>
-            <w:r>
-              <w:rPr>
-                <w:b/>
-              </w:rPr>
-              <w:t>source_distinct_keys</w:t>
-            </w:r>
-          </w:p>
-        </w:tc>
-        <w:tc>
-          <w:tcPr>
-            <w:tcW w:type="dxa" w:w="4320"/>
-          </w:tcPr>
-          <w:p>
-            <w:r/>
-          </w:p>
-        </w:tc>
-      </w:tr>
-      <w:tr>
-        <w:tc>
-          <w:tcPr>
-            <w:tcW w:type="dxa" w:w="4320"/>
-          </w:tcPr>
-          <w:p>
-            <w:r>
-              <w:rPr>
-                <w:b/>
-              </w:rPr>
-              <w:t>hub_present_keys</w:t>
-            </w:r>
-          </w:p>
-        </w:tc>
-        <w:tc>
-          <w:tcPr>
-            <w:tcW w:type="dxa" w:w="4320"/>
-          </w:tcPr>
-          <w:p>
-            <w:r/>
-          </w:p>
-        </w:tc>
-      </w:tr>
-      <w:tr>
-        <w:tc>
-          <w:tcPr>
-            <w:tcW w:type="dxa" w:w="4320"/>
-          </w:tcPr>
-          <w:p>
-            <w:r>
-              <w:rPr>
-                <w:b/>
-              </w:rPr>
-              <w:t>diff</w:t>
-            </w:r>
-          </w:p>
-        </w:tc>
-        <w:tc>
-          <w:tcPr>
-            <w:tcW w:type="dxa" w:w="4320"/>
-          </w:tcPr>
-          <w:p>
-            <w:r/>
-          </w:p>
-        </w:tc>
-      </w:tr>
     </w:tbl>
     <w:p/>
     <w:p>
@@ -804,75 +735,6 @@
           </w:p>
         </w:tc>
       </w:tr>
-      <w:tr>
-        <w:tc>
-          <w:tcPr>
-            <w:tcW w:type="dxa" w:w="4320"/>
-          </w:tcPr>
-          <w:p>
-            <w:r>
-              <w:rPr>
-                <w:b/>
-              </w:rPr>
-              <w:t>source_distinct_keys</w:t>
-            </w:r>
-          </w:p>
-        </w:tc>
-        <w:tc>
-          <w:tcPr>
-            <w:tcW w:type="dxa" w:w="4320"/>
-          </w:tcPr>
-          <w:p>
-            <w:r/>
-          </w:p>
-        </w:tc>
-      </w:tr>
-      <w:tr>
-        <w:tc>
-          <w:tcPr>
-            <w:tcW w:type="dxa" w:w="4320"/>
-          </w:tcPr>
-          <w:p>
-            <w:r>
-              <w:rPr>
-                <w:b/>
-              </w:rPr>
-              <w:t>hub_present_keys</w:t>
-            </w:r>
-          </w:p>
-        </w:tc>
-        <w:tc>
-          <w:tcPr>
-            <w:tcW w:type="dxa" w:w="4320"/>
-          </w:tcPr>
-          <w:p>
-            <w:r/>
-          </w:p>
-        </w:tc>
-      </w:tr>
-      <w:tr>
-        <w:tc>
-          <w:tcPr>
-            <w:tcW w:type="dxa" w:w="4320"/>
-          </w:tcPr>
-          <w:p>
-            <w:r>
-              <w:rPr>
-                <w:b/>
-              </w:rPr>
-              <w:t>diff</w:t>
-            </w:r>
-          </w:p>
-        </w:tc>
-        <w:tc>
-          <w:tcPr>
-            <w:tcW w:type="dxa" w:w="4320"/>
-          </w:tcPr>
-          <w:p>
-            <w:r/>
-          </w:p>
-        </w:tc>
-      </w:tr>
     </w:tbl>
     <w:p/>
     <w:p>
@@ -1123,75 +985,6 @@
           </w:p>
         </w:tc>
       </w:tr>
-      <w:tr>
-        <w:tc>
-          <w:tcPr>
-            <w:tcW w:type="dxa" w:w="4320"/>
-          </w:tcPr>
-          <w:p>
-            <w:r>
-              <w:rPr>
-                <w:b/>
-              </w:rPr>
-              <w:t>source_distinct_keys</w:t>
-            </w:r>
-          </w:p>
-        </w:tc>
-        <w:tc>
-          <w:tcPr>
-            <w:tcW w:type="dxa" w:w="4320"/>
-          </w:tcPr>
-          <w:p>
-            <w:r/>
-          </w:p>
-        </w:tc>
-      </w:tr>
-      <w:tr>
-        <w:tc>
-          <w:tcPr>
-            <w:tcW w:type="dxa" w:w="4320"/>
-          </w:tcPr>
-          <w:p>
-            <w:r>
-              <w:rPr>
-                <w:b/>
-              </w:rPr>
-              <w:t>hub_present_keys</w:t>
-            </w:r>
-          </w:p>
-        </w:tc>
-        <w:tc>
-          <w:tcPr>
-            <w:tcW w:type="dxa" w:w="4320"/>
-          </w:tcPr>
-          <w:p>
-            <w:r/>
-          </w:p>
-        </w:tc>
-      </w:tr>
-      <w:tr>
-        <w:tc>
-          <w:tcPr>
-            <w:tcW w:type="dxa" w:w="4320"/>
-          </w:tcPr>
-          <w:p>
-            <w:r>
-              <w:rPr>
-                <w:b/>
-              </w:rPr>
-              <w:t>diff</w:t>
-            </w:r>
-          </w:p>
-        </w:tc>
-        <w:tc>
-          <w:tcPr>
-            <w:tcW w:type="dxa" w:w="4320"/>
-          </w:tcPr>
-          <w:p>
-            <w:r/>
-          </w:p>
-        </w:tc>
-      </w:tr>
     </w:tbl>
     <w:p/>
     <w:p>
@@ -1502,75 +1295,6 @@
           </w:p>
         </w:tc>
       </w:tr>
-      <w:tr>
-        <w:tc>
-          <w:tcPr>
-            <w:tcW w:type="dxa" w:w="4320"/>
-          </w:tcPr>
-          <w:p>
-            <w:r>
-              <w:rPr>
-                <w:b/>
-              </w:rPr>
-              <w:t>source_distinct_keys</w:t>
-            </w:r>
-          </w:p>
-        </w:tc>
-        <w:tc>
-          <w:tcPr>
-            <w:tcW w:type="dxa" w:w="4320"/>
-          </w:tcPr>
-          <w:p>
-            <w:r/>
-          </w:p>
-        </w:tc>
-      </w:tr>
-      <w:tr>
-        <w:tc>
-          <w:tcPr>
-            <w:tcW w:type="dxa" w:w="4320"/>
-          </w:tcPr>
-          <w:p>
-            <w:r>
-              <w:rPr>
-                <w:b/>
-              </w:rPr>
-              <w:t>hub_present_keys</w:t>
-            </w:r>
-          </w:p>
-        </w:tc>
-        <w:tc>
-          <w:tcPr>
-            <w:tcW w:type="dxa" w:w="4320"/>
-          </w:tcPr>
-          <w:p>
-            <w:r/>
-          </w:p>
-        </w:tc>
-      </w:tr>
-      <w:tr>
-        <w:tc>
-          <w:tcPr>
-            <w:tcW w:type="dxa" w:w="4320"/>
-          </w:tcPr>
-          <w:p>
-            <w:r>
-              <w:rPr>
-                <w:b/>
-              </w:rPr>
-              <w:t>diff</w:t>
-            </w:r>
-          </w:p>
-        </w:tc>
-        <w:tc>
-          <w:tcPr>
-            <w:tcW w:type="dxa" w:w="4320"/>
-          </w:tcPr>
-          <w:p>
-            <w:r/>
-          </w:p>
-        </w:tc>
-      </w:tr>
     </w:tbl>
     <w:p/>
     <w:p>
@@ -1821,75 +1545,6 @@
           </w:p>
         </w:tc>
       </w:tr>
-      <w:tr>
-        <w:tc>
-          <w:tcPr>
-            <w:tcW w:type="dxa" w:w="4320"/>
-          </w:tcPr>
-          <w:p>
-            <w:r>
-              <w:rPr>
-                <w:b/>
-              </w:rPr>
-              <w:t>source_distinct_keys</w:t>
-            </w:r>
-          </w:p>
-        </w:tc>
-        <w:tc>
-          <w:tcPr>
-            <w:tcW w:type="dxa" w:w="4320"/>
-          </w:tcPr>
-          <w:p>
-            <w:r/>
-          </w:p>
-        </w:tc>
-      </w:tr>
-      <w:tr>
-        <w:tc>
-          <w:tcPr>
-            <w:tcW w:type="dxa" w:w="4320"/>
-          </w:tcPr>
-          <w:p>
-            <w:r>
-              <w:rPr>
-                <w:b/>
-              </w:rPr>
-              <w:t>hub_present_keys</w:t>
-            </w:r>
-          </w:p>
-        </w:tc>
-        <w:tc>
-          <w:tcPr>
-            <w:tcW w:type="dxa" w:w="4320"/>
-          </w:tcPr>
-          <w:p>
-            <w:r/>
-          </w:p>
-        </w:tc>
-      </w:tr>
-      <w:tr>
-        <w:tc>
-          <w:tcPr>
-            <w:tcW w:type="dxa" w:w="4320"/>
-          </w:tcPr>
-          <w:p>
-            <w:r>
-              <w:rPr>
-                <w:b/>
-              </w:rPr>
-              <w:t>diff</w:t>
-            </w:r>
-          </w:p>
-        </w:tc>
-        <w:tc>
-          <w:tcPr>
-            <w:tcW w:type="dxa" w:w="4320"/>
-          </w:tcPr>
-          <w:p>
-            <w:r/>
-          </w:p>
-        </w:tc>
-      </w:tr>
     </w:tbl>
     <w:p/>
     <w:p>
@@ -2140,75 +1795,6 @@
           </w:p>
         </w:tc>
       </w:tr>
-      <w:tr>
-        <w:tc>
-          <w:tcPr>
-            <w:tcW w:type="dxa" w:w="4320"/>
-          </w:tcPr>
-          <w:p>
-            <w:r>
-              <w:rPr>
-                <w:b/>
-              </w:rPr>
-              <w:t>source_distinct_keys</w:t>
-            </w:r>
-          </w:p>
-        </w:tc>
-        <w:tc>
-          <w:tcPr>
-            <w:tcW w:type="dxa" w:w="4320"/>
-          </w:tcPr>
-          <w:p>
-            <w:r/>
-          </w:p>
-        </w:tc>
-      </w:tr>
-      <w:tr>
-        <w:tc>
-          <w:tcPr>
-            <w:tcW w:type="dxa" w:w="4320"/>
-          </w:tcPr>
-          <w:p>
-            <w:r>
-              <w:rPr>
-                <w:b/>
-              </w:rPr>
-              <w:t>hub_present_keys</w:t>
-            </w:r>
-          </w:p>
-        </w:tc>
-        <w:tc>
-          <w:tcPr>
-            <w:tcW w:type="dxa" w:w="4320"/>
-          </w:tcPr>
-          <w:p>
-            <w:r/>
-          </w:p>
-        </w:tc>
-      </w:tr>
-      <w:tr>
-        <w:tc>
-          <w:tcPr>
-            <w:tcW w:type="dxa" w:w="4320"/>
-          </w:tcPr>
-          <w:p>
-            <w:r>
-              <w:rPr>
-                <w:b/>
-              </w:rPr>
-              <w:t>diff</w:t>
-            </w:r>
-          </w:p>
-        </w:tc>
-        <w:tc>
-          <w:tcPr>
-            <w:tcW w:type="dxa" w:w="4320"/>
-          </w:tcPr>
-          <w:p>
-            <w:r/>
-          </w:p>
-        </w:tc>
-      </w:tr>
     </w:tbl>
     <w:p/>
     <w:p>
@@ -2424,75 +2010,6 @@
           </w:p>
         </w:tc>
       </w:tr>
-      <w:tr>
-        <w:tc>
-          <w:tcPr>
-            <w:tcW w:type="dxa" w:w="4320"/>
-          </w:tcPr>
-          <w:p>
-            <w:r>
-              <w:rPr>
-                <w:b/>
-              </w:rPr>
-              <w:t>source_distinct_keys</w:t>
-            </w:r>
-          </w:p>
-        </w:tc>
-        <w:tc>
-          <w:tcPr>
-            <w:tcW w:type="dxa" w:w="4320"/>
-          </w:tcPr>
-          <w:p>
-            <w:r/>
-          </w:p>
-        </w:tc>
-      </w:tr>
-      <w:tr>
-        <w:tc>
-          <w:tcPr>
-            <w:tcW w:type="dxa" w:w="4320"/>
-          </w:tcPr>
-          <w:p>
-            <w:r>
-              <w:rPr>
-                <w:b/>
-              </w:rPr>
-              <w:t>hub_present_keys</w:t>
-            </w:r>
-          </w:p>
-        </w:tc>
-        <w:tc>
-          <w:tcPr>
-            <w:tcW w:type="dxa" w:w="4320"/>
-          </w:tcPr>
-          <w:p>
-            <w:r/>
-          </w:p>
-        </w:tc>
-      </w:tr>
-      <w:tr>
-        <w:tc>
-          <w:tcPr>
-            <w:tcW w:type="dxa" w:w="4320"/>
-          </w:tcPr>
-          <w:p>
-            <w:r>
-              <w:rPr>
-                <w:b/>
-              </w:rPr>
-              <w:t>diff</w:t>
-            </w:r>
-          </w:p>
-        </w:tc>
-        <w:tc>
-          <w:tcPr>
-            <w:tcW w:type="dxa" w:w="4320"/>
-          </w:tcPr>
-          <w:p>
-            <w:r/>
-          </w:p>
-        </w:tc>
-      </w:tr>
     </w:tbl>
     <w:p/>
     <w:p>
@@ -2743,75 +2260,6 @@
           </w:p>
         </w:tc>
       </w:tr>
-      <w:tr>
-        <w:tc>
-          <w:tcPr>
-            <w:tcW w:type="dxa" w:w="4320"/>
-          </w:tcPr>
-          <w:p>
-            <w:r>
-              <w:rPr>
-                <w:b/>
-              </w:rPr>
-              <w:t>source_distinct_keys</w:t>
-            </w:r>
-          </w:p>
-        </w:tc>
-        <w:tc>
-          <w:tcPr>
-            <w:tcW w:type="dxa" w:w="4320"/>
-          </w:tcPr>
-          <w:p>
-            <w:r/>
-          </w:p>
-        </w:tc>
-      </w:tr>
-      <w:tr>
-        <w:tc>
-          <w:tcPr>
-            <w:tcW w:type="dxa" w:w="4320"/>
-          </w:tcPr>
-          <w:p>
-            <w:r>
-              <w:rPr>
-                <w:b/>
-              </w:rPr>
-              <w:t>hub_present_keys</w:t>
-            </w:r>
-          </w:p>
-        </w:tc>
-        <w:tc>
-          <w:tcPr>
-            <w:tcW w:type="dxa" w:w="4320"/>
-          </w:tcPr>
-          <w:p>
-            <w:r/>
-          </w:p>
-        </w:tc>
-      </w:tr>
-      <w:tr>
-        <w:tc>
-          <w:tcPr>
-            <w:tcW w:type="dxa" w:w="4320"/>
-          </w:tcPr>
-          <w:p>
-            <w:r>
-              <w:rPr>
-                <w:b/>
-              </w:rPr>
-              <w:t>diff</w:t>
-            </w:r>
-          </w:p>
-        </w:tc>
-        <w:tc>
-          <w:tcPr>
-            <w:tcW w:type="dxa" w:w="4320"/>
-          </w:tcPr>
-          <w:p>
-            <w:r/>
-          </w:p>
-        </w:tc>
-      </w:tr>
     </w:tbl>
     <w:p/>
     <w:p>
@@ -3062,75 +2510,6 @@
           </w:p>
         </w:tc>
       </w:tr>
-      <w:tr>
-        <w:tc>
-          <w:tcPr>
-            <w:tcW w:type="dxa" w:w="4320"/>
-          </w:tcPr>
-          <w:p>
-            <w:r>
-              <w:rPr>
-                <w:b/>
-              </w:rPr>
-              <w:t>source_distinct_keys</w:t>
-            </w:r>
-          </w:p>
-        </w:tc>
-        <w:tc>
-          <w:tcPr>
-            <w:tcW w:type="dxa" w:w="4320"/>
-          </w:tcPr>
-          <w:p>
-            <w:r/>
-          </w:p>
-        </w:tc>
-      </w:tr>
-      <w:tr>
-        <w:tc>
-          <w:tcPr>
-            <w:tcW w:type="dxa" w:w="4320"/>
-          </w:tcPr>
-          <w:p>
-            <w:r>
-              <w:rPr>
-                <w:b/>
-              </w:rPr>
-              <w:t>hub_present_keys</w:t>
-            </w:r>
-          </w:p>
-        </w:tc>
-        <w:tc>
-          <w:tcPr>
-            <w:tcW w:type="dxa" w:w="4320"/>
-          </w:tcPr>
-          <w:p>
-            <w:r/>
-          </w:p>
-        </w:tc>
-      </w:tr>
-      <w:tr>
-        <w:tc>
-          <w:tcPr>
-            <w:tcW w:type="dxa" w:w="4320"/>
-          </w:tcPr>
-          <w:p>
-            <w:r>
-              <w:rPr>
-                <w:b/>
-              </w:rPr>
-              <w:t>diff</w:t>
-            </w:r>
-          </w:p>
-        </w:tc>
-        <w:tc>
-          <w:tcPr>
-            <w:tcW w:type="dxa" w:w="4320"/>
-          </w:tcPr>
-          <w:p>
-            <w:r/>
-          </w:p>
-        </w:tc>
-      </w:tr>
     </w:tbl>
     <w:p/>
     <w:p>
@@ -3381,75 +2760,6 @@
           </w:p>
         </w:tc>
       </w:tr>
-      <w:tr>
-        <w:tc>
-          <w:tcPr>
-            <w:tcW w:type="dxa" w:w="4320"/>
-          </w:tcPr>
-          <w:p>
-            <w:r>
-              <w:rPr>
-                <w:b/>
-              </w:rPr>
-              <w:t>source_distinct_keys</w:t>
-            </w:r>
-          </w:p>
-        </w:tc>
-        <w:tc>
-          <w:tcPr>
-            <w:tcW w:type="dxa" w:w="4320"/>
-          </w:tcPr>
-          <w:p>
-            <w:r/>
-          </w:p>
-        </w:tc>
-      </w:tr>
-      <w:tr>
-        <w:tc>
-          <w:tcPr>
-            <w:tcW w:type="dxa" w:w="4320"/>
-          </w:tcPr>
-          <w:p>
-            <w:r>
-              <w:rPr>
-                <w:b/>
-              </w:rPr>
-              <w:t>hub_present_keys</w:t>
-            </w:r>
-          </w:p>
-        </w:tc>
-        <w:tc>
-          <w:tcPr>
-            <w:tcW w:type="dxa" w:w="4320"/>
-          </w:tcPr>
-          <w:p>
-            <w:r/>
-          </w:p>
-        </w:tc>
-      </w:tr>
-      <w:tr>
-        <w:tc>
-          <w:tcPr>
-            <w:tcW w:type="dxa" w:w="4320"/>
-          </w:tcPr>
-          <w:p>
-            <w:r>
-              <w:rPr>
-                <w:b/>
-              </w:rPr>
-              <w:t>diff</w:t>
-            </w:r>
-          </w:p>
-        </w:tc>
-        <w:tc>
-          <w:tcPr>
-            <w:tcW w:type="dxa" w:w="4320"/>
-          </w:tcPr>
-          <w:p>
-            <w:r/>
-          </w:p>
-        </w:tc>
-      </w:tr>
     </w:tbl>
     <w:p/>
     <w:p>
@@ -3708,75 +3018,6 @@
           </w:p>
         </w:tc>
       </w:tr>
-      <w:tr>
-        <w:tc>
-          <w:tcPr>
-            <w:tcW w:type="dxa" w:w="4320"/>
-          </w:tcPr>
-          <w:p>
-            <w:r>
-              <w:rPr>
-                <w:b/>
-              </w:rPr>
-              <w:t>source_distinct_keys</w:t>
-            </w:r>
-          </w:p>
-        </w:tc>
-        <w:tc>
-          <w:tcPr>
-            <w:tcW w:type="dxa" w:w="4320"/>
-          </w:tcPr>
-          <w:p>
-            <w:r/>
-          </w:p>
-        </w:tc>
-      </w:tr>
-      <w:tr>
-        <w:tc>
-          <w:tcPr>
-            <w:tcW w:type="dxa" w:w="4320"/>
-          </w:tcPr>
-          <w:p>
-            <w:r>
-              <w:rPr>
-                <w:b/>
-              </w:rPr>
-              <w:t>hub_present_keys</w:t>
-            </w:r>
-          </w:p>
-        </w:tc>
-        <w:tc>
-          <w:tcPr>
-            <w:tcW w:type="dxa" w:w="4320"/>
-          </w:tcPr>
-          <w:p>
-            <w:r/>
-          </w:p>
-        </w:tc>
-      </w:tr>
-      <w:tr>
-        <w:tc>
-          <w:tcPr>
-            <w:tcW w:type="dxa" w:w="4320"/>
-          </w:tcPr>
-          <w:p>
-            <w:r>
-              <w:rPr>
-                <w:b/>
-              </w:rPr>
-              <w:t>diff</w:t>
-            </w:r>
-          </w:p>
-        </w:tc>
-        <w:tc>
-          <w:tcPr>
-            <w:tcW w:type="dxa" w:w="4320"/>
-          </w:tcPr>
-          <w:p>
-            <w:r/>
-          </w:p>
-        </w:tc>
-      </w:tr>
     </w:tbl>
     <w:p/>
     <w:p>
@@ -4027,75 +3268,6 @@
           </w:p>
         </w:tc>
       </w:tr>
-      <w:tr>
-        <w:tc>
-          <w:tcPr>
-            <w:tcW w:type="dxa" w:w="4320"/>
-          </w:tcPr>
-          <w:p>
-            <w:r>
-              <w:rPr>
-                <w:b/>
-              </w:rPr>
-              <w:t>source_distinct_keys</w:t>
-            </w:r>
-          </w:p>
-        </w:tc>
-        <w:tc>
-          <w:tcPr>
-            <w:tcW w:type="dxa" w:w="4320"/>
-          </w:tcPr>
-          <w:p>
-            <w:r/>
-          </w:p>
-        </w:tc>
-      </w:tr>
-      <w:tr>
-        <w:tc>
-          <w:tcPr>
-            <w:tcW w:type="dxa" w:w="4320"/>
-          </w:tcPr>
-          <w:p>
-            <w:r>
-              <w:rPr>
-                <w:b/>
-              </w:rPr>
-              <w:t>hub_present_keys</w:t>
-            </w:r>
-          </w:p>
-        </w:tc>
-        <w:tc>
-          <w:tcPr>
-            <w:tcW w:type="dxa" w:w="4320"/>
-          </w:tcPr>
-          <w:p>
-            <w:r/>
-          </w:p>
-        </w:tc>
-      </w:tr>
-      <w:tr>
-        <w:tc>
-          <w:tcPr>
-            <w:tcW w:type="dxa" w:w="4320"/>
-          </w:tcPr>
-          <w:p>
-            <w:r>
-              <w:rPr>
-                <w:b/>
-              </w:rPr>
-              <w:t>diff</w:t>
-            </w:r>
-          </w:p>
-        </w:tc>
-        <w:tc>
-          <w:tcPr>
-            <w:tcW w:type="dxa" w:w="4320"/>
-          </w:tcPr>
-          <w:p>
-            <w:r/>
-          </w:p>
-        </w:tc>
-      </w:tr>
     </w:tbl>
     <w:p/>
     <w:p>
@@ -4346,75 +3518,6 @@
           </w:p>
         </w:tc>
       </w:tr>
-      <w:tr>
-        <w:tc>
-          <w:tcPr>
-            <w:tcW w:type="dxa" w:w="4320"/>
-          </w:tcPr>
-          <w:p>
-            <w:r>
-              <w:rPr>
-                <w:b/>
-              </w:rPr>
-              <w:t>source_distinct_keys</w:t>
-            </w:r>
-          </w:p>
-        </w:tc>
-        <w:tc>
-          <w:tcPr>
-            <w:tcW w:type="dxa" w:w="4320"/>
-          </w:tcPr>
-          <w:p>
-            <w:r/>
-          </w:p>
-        </w:tc>
-      </w:tr>
-      <w:tr>
-        <w:tc>
-          <w:tcPr>
-            <w:tcW w:type="dxa" w:w="4320"/>
-          </w:tcPr>
-          <w:p>
-            <w:r>
-              <w:rPr>
-                <w:b/>
-              </w:rPr>
-              <w:t>hub_present_keys</w:t>
-            </w:r>
-          </w:p>
-        </w:tc>
-        <w:tc>
-          <w:tcPr>
-            <w:tcW w:type="dxa" w:w="4320"/>
-          </w:tcPr>
-          <w:p>
-            <w:r/>
-          </w:p>
-        </w:tc>
-      </w:tr>
-      <w:tr>
-        <w:tc>
-          <w:tcPr>
-            <w:tcW w:type="dxa" w:w="4320"/>
-          </w:tcPr>
-          <w:p>
-            <w:r>
-              <w:rPr>
-                <w:b/>
-              </w:rPr>
-              <w:t>diff</w:t>
-            </w:r>
-          </w:p>
-        </w:tc>
-        <w:tc>
-          <w:tcPr>
-            <w:tcW w:type="dxa" w:w="4320"/>
-          </w:tcPr>
-          <w:p>
-            <w:r/>
-          </w:p>
-        </w:tc>
-      </w:tr>
     </w:tbl>
     <w:p/>
     <w:p>
@@ -4665,75 +3768,6 @@
           </w:p>
         </w:tc>
       </w:tr>
-      <w:tr>
-        <w:tc>
-          <w:tcPr>
-            <w:tcW w:type="dxa" w:w="4320"/>
-          </w:tcPr>
-          <w:p>
-            <w:r>
-              <w:rPr>
-                <w:b/>
-              </w:rPr>
-              <w:t>source_distinct_keys</w:t>
-            </w:r>
-          </w:p>
-        </w:tc>
-        <w:tc>
-          <w:tcPr>
-            <w:tcW w:type="dxa" w:w="4320"/>
-          </w:tcPr>
-          <w:p>
-            <w:r/>
-          </w:p>
-        </w:tc>
-      </w:tr>
-      <w:tr>
-        <w:tc>
-          <w:tcPr>
-            <w:tcW w:type="dxa" w:w="4320"/>
-          </w:tcPr>
-          <w:p>
-            <w:r>
-              <w:rPr>
-                <w:b/>
-              </w:rPr>
-              <w:t>hub_present_keys</w:t>
-            </w:r>
-          </w:p>
-        </w:tc>
-        <w:tc>
-          <w:tcPr>
-            <w:tcW w:type="dxa" w:w="4320"/>
-          </w:tcPr>
-          <w:p>
-            <w:r/>
-          </w:p>
-        </w:tc>
-      </w:tr>
-      <w:tr>
-        <w:tc>
-          <w:tcPr>
-            <w:tcW w:type="dxa" w:w="4320"/>
-          </w:tcPr>
-          <w:p>
-            <w:r>
-              <w:rPr>
-                <w:b/>
-              </w:rPr>
-              <w:t>diff</w:t>
-            </w:r>
-          </w:p>
-        </w:tc>
-        <w:tc>
-          <w:tcPr>
-            <w:tcW w:type="dxa" w:w="4320"/>
-          </w:tcPr>
-          <w:p>
-            <w:r/>
-          </w:p>
-        </w:tc>
-      </w:tr>
     </w:tbl>
     <w:p/>
     <w:p>
@@ -4984,75 +4018,6 @@
           </w:p>
         </w:tc>
       </w:tr>
-      <w:tr>
-        <w:tc>
-          <w:tcPr>
-            <w:tcW w:type="dxa" w:w="4320"/>
-          </w:tcPr>
-          <w:p>
-            <w:r>
-              <w:rPr>
-                <w:b/>
-              </w:rPr>
-              <w:t>source_distinct_keys</w:t>
-            </w:r>
-          </w:p>
-        </w:tc>
-        <w:tc>
-          <w:tcPr>
-            <w:tcW w:type="dxa" w:w="4320"/>
-          </w:tcPr>
-          <w:p>
-            <w:r/>
-          </w:p>
-        </w:tc>
-      </w:tr>
-      <w:tr>
-        <w:tc>
-          <w:tcPr>
-            <w:tcW w:type="dxa" w:w="4320"/>
-          </w:tcPr>
-          <w:p>
-            <w:r>
-              <w:rPr>
-                <w:b/>
-              </w:rPr>
-              <w:t>hub_present_keys</w:t>
-            </w:r>
-          </w:p>
-        </w:tc>
-        <w:tc>
-          <w:tcPr>
-            <w:tcW w:type="dxa" w:w="4320"/>
-          </w:tcPr>
-          <w:p>
-            <w:r/>
-          </w:p>
-        </w:tc>
-      </w:tr>
-      <w:tr>
-        <w:tc>
-          <w:tcPr>
-            <w:tcW w:type="dxa" w:w="4320"/>
-          </w:tcPr>
-          <w:p>
-            <w:r>
-              <w:rPr>
-                <w:b/>
-              </w:rPr>
-              <w:t>diff</w:t>
-            </w:r>
-          </w:p>
-        </w:tc>
-        <w:tc>
-          <w:tcPr>
-            <w:tcW w:type="dxa" w:w="4320"/>
-          </w:tcPr>
-          <w:p>
-            <w:r/>
-          </w:p>
-        </w:tc>
-      </w:tr>
     </w:tbl>
     <w:p/>
     <w:p>
@@ -5303,75 +4268,6 @@
           </w:p>
         </w:tc>
       </w:tr>
-      <w:tr>
-        <w:tc>
-          <w:tcPr>
-            <w:tcW w:type="dxa" w:w="4320"/>
-          </w:tcPr>
-          <w:p>
-            <w:r>
-              <w:rPr>
-                <w:b/>
-              </w:rPr>
-              <w:t>source_distinct_keys</w:t>
-            </w:r>
-          </w:p>
-        </w:tc>
-        <w:tc>
-          <w:tcPr>
-            <w:tcW w:type="dxa" w:w="4320"/>
-          </w:tcPr>
-          <w:p>
-            <w:r/>
-          </w:p>
-        </w:tc>
-      </w:tr>
-      <w:tr>
-        <w:tc>
-          <w:tcPr>
-            <w:tcW w:type="dxa" w:w="4320"/>
-          </w:tcPr>
-          <w:p>
-            <w:r>
-              <w:rPr>
-                <w:b/>
-              </w:rPr>
-              <w:t>hub_present_keys</w:t>
-            </w:r>
-          </w:p>
-        </w:tc>
-        <w:tc>
-          <w:tcPr>
-            <w:tcW w:type="dxa" w:w="4320"/>
-          </w:tcPr>
-          <w:p>
-            <w:r/>
-          </w:p>
-        </w:tc>
-      </w:tr>
-      <w:tr>
-        <w:tc>
-          <w:tcPr>
-            <w:tcW w:type="dxa" w:w="4320"/>
-          </w:tcPr>
-          <w:p>
-            <w:r>
-              <w:rPr>
-                <w:b/>
-              </w:rPr>
-              <w:t>diff</w:t>
-            </w:r>
-          </w:p>
-        </w:tc>
-        <w:tc>
-          <w:tcPr>
-            <w:tcW w:type="dxa" w:w="4320"/>
-          </w:tcPr>
-          <w:p>
-            <w:r/>
-          </w:p>
-        </w:tc>
-      </w:tr>
     </w:tbl>
     <w:p/>
     <w:p>
@@ -5662,75 +4558,6 @@
           </w:p>
         </w:tc>
       </w:tr>
-      <w:tr>
-        <w:tc>
-          <w:tcPr>
-            <w:tcW w:type="dxa" w:w="4320"/>
-          </w:tcPr>
-          <w:p>
-            <w:r>
-              <w:rPr>
-                <w:b/>
-              </w:rPr>
-              <w:t>source_distinct_keys</w:t>
-            </w:r>
-          </w:p>
-        </w:tc>
-        <w:tc>
-          <w:tcPr>
-            <w:tcW w:type="dxa" w:w="4320"/>
-          </w:tcPr>
-          <w:p>
-            <w:r/>
-          </w:p>
-        </w:tc>
-      </w:tr>
-      <w:tr>
-        <w:tc>
-          <w:tcPr>
-            <w:tcW w:type="dxa" w:w="4320"/>
-          </w:tcPr>
-          <w:p>
-            <w:r>
-              <w:rPr>
-                <w:b/>
-              </w:rPr>
-              <w:t>hub_present_keys</w:t>
-            </w:r>
-          </w:p>
-        </w:tc>
-        <w:tc>
-          <w:tcPr>
-            <w:tcW w:type="dxa" w:w="4320"/>
-          </w:tcPr>
-          <w:p>
-            <w:r/>
-          </w:p>
-        </w:tc>
-      </w:tr>
-      <w:tr>
-        <w:tc>
-          <w:tcPr>
-            <w:tcW w:type="dxa" w:w="4320"/>
-          </w:tcPr>
-          <w:p>
-            <w:r>
-              <w:rPr>
-                <w:b/>
-              </w:rPr>
-              <w:t>diff</w:t>
-            </w:r>
-          </w:p>
-        </w:tc>
-        <w:tc>
-          <w:tcPr>
-            <w:tcW w:type="dxa" w:w="4320"/>
-          </w:tcPr>
-          <w:p>
-            <w:r/>
-          </w:p>
-        </w:tc>
-      </w:tr>
     </w:tbl>
     <w:p/>
     <w:p>
@@ -6021,75 +4848,6 @@
           </w:p>
         </w:tc>
       </w:tr>
-      <w:tr>
-        <w:tc>
-          <w:tcPr>
-            <w:tcW w:type="dxa" w:w="4320"/>
-          </w:tcPr>
-          <w:p>
-            <w:r>
-              <w:rPr>
-                <w:b/>
-              </w:rPr>
-              <w:t>source_distinct_keys</w:t>
-            </w:r>
-          </w:p>
-        </w:tc>
-        <w:tc>
-          <w:tcPr>
-            <w:tcW w:type="dxa" w:w="4320"/>
-          </w:tcPr>
-          <w:p>
-            <w:r/>
-          </w:p>
-        </w:tc>
-      </w:tr>
-      <w:tr>
-        <w:tc>
-          <w:tcPr>
-            <w:tcW w:type="dxa" w:w="4320"/>
-          </w:tcPr>
-          <w:p>
-            <w:r>
-              <w:rPr>
-                <w:b/>
-              </w:rPr>
-              <w:t>hub_present_keys</w:t>
-            </w:r>
-          </w:p>
-        </w:tc>
-        <w:tc>
-          <w:tcPr>
-            <w:tcW w:type="dxa" w:w="4320"/>
-          </w:tcPr>
-          <w:p>
-            <w:r/>
-          </w:p>
-        </w:tc>
-      </w:tr>
-      <w:tr>
-        <w:tc>
-          <w:tcPr>
-            <w:tcW w:type="dxa" w:w="4320"/>
-          </w:tcPr>
-          <w:p>
-            <w:r>
-              <w:rPr>
-                <w:b/>
-              </w:rPr>
-              <w:t>diff</w:t>
-            </w:r>
-          </w:p>
-        </w:tc>
-        <w:tc>
-          <w:tcPr>
-            <w:tcW w:type="dxa" w:w="4320"/>
-          </w:tcPr>
-          <w:p>
-            <w:r/>
-          </w:p>
-        </w:tc>
-      </w:tr>
     </w:tbl>
     <w:p/>
     <w:p>
@@ -6293,75 +5051,6 @@
                 <w:b/>
               </w:rPr>
               <w:t>Result (Pass / Fail / NA)</w:t>
-            </w:r>
-          </w:p>
-        </w:tc>
-        <w:tc>
-          <w:tcPr>
-            <w:tcW w:type="dxa" w:w="4320"/>
-          </w:tcPr>
-          <w:p>
-            <w:r/>
-          </w:p>
-        </w:tc>
-      </w:tr>
-      <w:tr>
-        <w:tc>
-          <w:tcPr>
-            <w:tcW w:type="dxa" w:w="4320"/>
-          </w:tcPr>
-          <w:p>
-            <w:r>
-              <w:rPr>
-                <w:b/>
-              </w:rPr>
-              <w:t>source_distinct_keys</w:t>
-            </w:r>
-          </w:p>
-        </w:tc>
-        <w:tc>
-          <w:tcPr>
-            <w:tcW w:type="dxa" w:w="4320"/>
-          </w:tcPr>
-          <w:p>
-            <w:r/>
-          </w:p>
-        </w:tc>
-      </w:tr>
-      <w:tr>
-        <w:tc>
-          <w:tcPr>
-            <w:tcW w:type="dxa" w:w="4320"/>
-          </w:tcPr>
-          <w:p>
-            <w:r>
-              <w:rPr>
-                <w:b/>
-              </w:rPr>
-              <w:t>hub_present_keys</w:t>
-            </w:r>
-          </w:p>
-        </w:tc>
-        <w:tc>
-          <w:tcPr>
-            <w:tcW w:type="dxa" w:w="4320"/>
-          </w:tcPr>
-          <w:p>
-            <w:r/>
-          </w:p>
-        </w:tc>
-      </w:tr>
-      <w:tr>
-        <w:tc>
-          <w:tcPr>
-            <w:tcW w:type="dxa" w:w="4320"/>
-          </w:tcPr>
-          <w:p>
-            <w:r>
-              <w:rPr>
-                <w:b/>
-              </w:rPr>
-              <w:t>diff</w:t>
             </w:r>
           </w:p>
         </w:tc>

</xml_diff>